<commit_message>
Front Matter 1-3 Done. Piece 3 edited Composition Year
</commit_message>
<xml_diff>
--- a/Front Matter/Template/1_Front-Matter_Template-v5.docx
+++ b/Front Matter/Template/1_Front-Matter_Template-v5.docx
@@ -4,41 +4,18 @@
   <w:body>
     <w:p>
       <w:pPr>
-        <w:jc w:val="right"/>
+        <w:jc w:val="center"/>
         <w:rPr>
           <w:rFonts w:ascii="Noto Serif" w:eastAsia="Noto Serif SC" w:hAnsi="Noto Serif" w:cs="Noto Serif"/>
           <w:b/>
-          <w:sz w:val="56"/>
-          <w:szCs w:val="72"/>
-        </w:rPr>
-      </w:pPr>
-    </w:p>
-    <w:p>
-      <w:pPr>
-        <w:jc w:val="right"/>
-        <w:rPr>
-          <w:rFonts w:ascii="Noto Serif" w:eastAsia="Noto Serif SC" w:hAnsi="Noto Serif" w:cs="Noto Serif"/>
-          <w:b/>
-          <w:sz w:val="56"/>
-          <w:szCs w:val="96"/>
-          <w:lang w:val="en-US"/>
-        </w:rPr>
-      </w:pPr>
-    </w:p>
-    <w:p>
-      <w:pPr>
-        <w:jc w:val="right"/>
-        <w:rPr>
-          <w:rFonts w:ascii="Noto Serif" w:eastAsia="Noto Serif SC" w:hAnsi="Noto Serif" w:cs="Noto Serif"/>
-          <w:b/>
-          <w:sz w:val="56"/>
-          <w:szCs w:val="96"/>
-          <w:lang w:val="en-US"/>
-        </w:rPr>
-      </w:pPr>
-    </w:p>
-    <w:p>
-      <w:pPr>
+          <w:sz w:val="40"/>
+          <w:szCs w:val="40"/>
+        </w:rPr>
+      </w:pPr>
+    </w:p>
+    <w:p>
+      <w:pPr>
+        <w:spacing w:before="2000"/>
         <w:jc w:val="right"/>
         <w:rPr>
           <w:rFonts w:ascii="Noto Serif" w:eastAsia="Noto Serif SC" w:hAnsi="Noto Serif" w:cs="Noto Serif"/>
@@ -142,17 +119,7 @@
     </w:p>
     <w:p>
       <w:pPr>
-        <w:jc w:val="right"/>
-        <w:rPr>
-          <w:rFonts w:ascii="Noto Serif" w:eastAsia="Noto Serif SC" w:hAnsi="Noto Serif" w:cs="Noto Serif"/>
-          <w:sz w:val="28"/>
-          <w:szCs w:val="28"/>
-          <w:lang w:val="en-US"/>
-        </w:rPr>
-      </w:pPr>
-    </w:p>
-    <w:p>
-      <w:pPr>
+        <w:spacing w:before="400"/>
         <w:jc w:val="right"/>
         <w:rPr>
           <w:rFonts w:ascii="Noto Serif" w:eastAsia="Noto Serif SC" w:hAnsi="Noto Serif" w:cs="Noto Serif"/>
@@ -172,6 +139,7 @@
     </w:p>
     <w:p>
       <w:pPr>
+        <w:spacing w:after="240"/>
         <w:jc w:val="right"/>
         <w:rPr>
           <w:rFonts w:ascii="Noto Serif" w:eastAsia="Noto Serif SC" w:hAnsi="Noto Serif" w:cs="Noto Serif"/>
@@ -187,16 +155,6 @@
         </w:rPr>
         <w:t>For Chinese Orchestra</w:t>
       </w:r>
-    </w:p>
-    <w:p>
-      <w:pPr>
-        <w:jc w:val="right"/>
-        <w:rPr>
-          <w:rFonts w:ascii="Noto Serif" w:eastAsia="Noto Serif SC" w:hAnsi="Noto Serif" w:cs="Noto Serif"/>
-          <w:sz w:val="32"/>
-          <w:szCs w:val="56"/>
-        </w:rPr>
-      </w:pPr>
     </w:p>
     <w:p>
       <w:pPr>
@@ -213,17 +171,7 @@
     </w:p>
     <w:p>
       <w:pPr>
-        <w:jc w:val="right"/>
-        <w:rPr>
-          <w:rFonts w:ascii="Noto Serif" w:eastAsia="Noto Serif SC" w:hAnsi="Noto Serif" w:cs="Noto Serif"/>
-          <w:sz w:val="40"/>
-          <w:szCs w:val="96"/>
-          <w:lang w:val="en-US"/>
-        </w:rPr>
-      </w:pPr>
-    </w:p>
-    <w:p>
-      <w:pPr>
+        <w:spacing w:before="400"/>
         <w:jc w:val="right"/>
         <w:rPr>
           <w:rFonts w:ascii="Noto Serif" w:eastAsia="Noto Serif SC" w:hAnsi="Noto Serif" w:cs="Noto Serif"/>
@@ -268,62 +216,6 @@
         <w:t>Xiangming</w:t>
       </w:r>
       <w:proofErr w:type="spellEnd"/>
-    </w:p>
-    <w:p>
-      <w:pPr>
-        <w:rPr>
-          <w:rFonts w:ascii="Noto Serif" w:eastAsia="Noto Serif SC" w:hAnsi="Noto Serif" w:cs="Noto Serif"/>
-          <w:sz w:val="18"/>
-        </w:rPr>
-      </w:pPr>
-    </w:p>
-    <w:p>
-      <w:pPr>
-        <w:rPr>
-          <w:rFonts w:ascii="Noto Serif" w:eastAsia="Noto Serif SC" w:hAnsi="Noto Serif" w:cs="Noto Serif"/>
-          <w:sz w:val="18"/>
-        </w:rPr>
-      </w:pPr>
-    </w:p>
-    <w:p>
-      <w:pPr>
-        <w:rPr>
-          <w:rFonts w:ascii="Noto Serif" w:eastAsia="Noto Serif SC" w:hAnsi="Noto Serif" w:cs="Noto Serif"/>
-          <w:sz w:val="18"/>
-        </w:rPr>
-      </w:pPr>
-    </w:p>
-    <w:p>
-      <w:pPr>
-        <w:rPr>
-          <w:rFonts w:ascii="Noto Serif" w:eastAsia="Noto Serif SC" w:hAnsi="Noto Serif" w:cs="Noto Serif"/>
-          <w:sz w:val="18"/>
-        </w:rPr>
-      </w:pPr>
-    </w:p>
-    <w:p>
-      <w:pPr>
-        <w:rPr>
-          <w:rFonts w:ascii="Noto Serif" w:eastAsia="Noto Serif SC" w:hAnsi="Noto Serif" w:cs="Noto Serif"/>
-          <w:sz w:val="18"/>
-        </w:rPr>
-      </w:pPr>
-    </w:p>
-    <w:p>
-      <w:pPr>
-        <w:rPr>
-          <w:rFonts w:ascii="Noto Serif" w:eastAsia="Noto Serif SC" w:hAnsi="Noto Serif" w:cs="Noto Serif"/>
-          <w:sz w:val="18"/>
-        </w:rPr>
-      </w:pPr>
-    </w:p>
-    <w:p>
-      <w:pPr>
-        <w:rPr>
-          <w:rFonts w:ascii="Noto Serif" w:eastAsia="Noto Serif SC" w:hAnsi="Noto Serif" w:cs="Noto Serif"/>
-          <w:sz w:val="18"/>
-        </w:rPr>
-      </w:pPr>
     </w:p>
     <w:p>
       <w:pPr>
@@ -441,318 +333,6 @@
           <w:rFonts w:ascii="Noto Serif" w:eastAsia="Noto Serif SC" w:hAnsi="Noto Serif" w:cs="Noto Serif"/>
           <w:sz w:val="18"/>
         </w:rPr>
-      </w:pPr>
-    </w:p>
-    <w:p>
-      <w:pPr>
-        <w:rPr>
-          <w:rFonts w:ascii="Noto Serif" w:eastAsia="Noto Serif SC" w:hAnsi="Noto Serif" w:cs="Noto Serif"/>
-          <w:sz w:val="18"/>
-        </w:rPr>
-      </w:pPr>
-    </w:p>
-    <w:p>
-      <w:pPr>
-        <w:rPr>
-          <w:rFonts w:ascii="Noto Serif" w:eastAsia="Noto Serif SC" w:hAnsi="Noto Serif" w:cs="Noto Serif"/>
-          <w:sz w:val="18"/>
-        </w:rPr>
-      </w:pPr>
-    </w:p>
-    <w:p>
-      <w:pPr>
-        <w:rPr>
-          <w:rFonts w:ascii="Noto Serif" w:eastAsia="Noto Serif SC" w:hAnsi="Noto Serif" w:cs="Noto Serif"/>
-          <w:sz w:val="18"/>
-        </w:rPr>
-      </w:pPr>
-    </w:p>
-    <w:p>
-      <w:pPr>
-        <w:rPr>
-          <w:rFonts w:ascii="Noto Serif" w:eastAsia="Noto Serif SC" w:hAnsi="Noto Serif" w:cs="Noto Serif"/>
-          <w:sz w:val="18"/>
-        </w:rPr>
-      </w:pPr>
-    </w:p>
-    <w:p>
-      <w:pPr>
-        <w:rPr>
-          <w:rFonts w:ascii="Noto Serif" w:eastAsia="Noto Serif SC" w:hAnsi="Noto Serif" w:cs="Noto Serif"/>
-          <w:sz w:val="18"/>
-        </w:rPr>
-      </w:pPr>
-    </w:p>
-    <w:p>
-      <w:pPr>
-        <w:rPr>
-          <w:rFonts w:ascii="Noto Serif" w:eastAsia="Noto Serif SC" w:hAnsi="Noto Serif" w:cs="Noto Serif"/>
-          <w:sz w:val="18"/>
-        </w:rPr>
-      </w:pPr>
-    </w:p>
-    <w:p>
-      <w:pPr>
-        <w:rPr>
-          <w:rFonts w:ascii="Noto Serif" w:eastAsia="Noto Serif SC" w:hAnsi="Noto Serif" w:cs="Noto Serif"/>
-          <w:sz w:val="18"/>
-        </w:rPr>
-      </w:pPr>
-    </w:p>
-    <w:p>
-      <w:pPr>
-        <w:rPr>
-          <w:rFonts w:ascii="Noto Serif" w:eastAsia="Noto Serif SC" w:hAnsi="Noto Serif" w:cs="Noto Serif"/>
-          <w:sz w:val="18"/>
-        </w:rPr>
-      </w:pPr>
-    </w:p>
-    <w:p>
-      <w:pPr>
-        <w:rPr>
-          <w:rFonts w:ascii="Noto Serif" w:eastAsia="Noto Serif SC" w:hAnsi="Noto Serif" w:cs="Noto Serif"/>
-          <w:sz w:val="18"/>
-        </w:rPr>
-      </w:pPr>
-    </w:p>
-    <w:p>
-      <w:pPr>
-        <w:rPr>
-          <w:rFonts w:ascii="Noto Serif" w:eastAsia="Noto Serif SC" w:hAnsi="Noto Serif" w:cs="Noto Serif"/>
-          <w:sz w:val="18"/>
-        </w:rPr>
-      </w:pPr>
-    </w:p>
-    <w:p>
-      <w:pPr>
-        <w:rPr>
-          <w:rFonts w:ascii="Noto Serif" w:eastAsia="Noto Serif SC" w:hAnsi="Noto Serif" w:cs="Noto Serif"/>
-          <w:sz w:val="18"/>
-        </w:rPr>
-      </w:pPr>
-    </w:p>
-    <w:p>
-      <w:pPr>
-        <w:rPr>
-          <w:rFonts w:ascii="Noto Serif" w:eastAsia="Noto Serif SC" w:hAnsi="Noto Serif" w:cs="Noto Serif"/>
-          <w:sz w:val="18"/>
-        </w:rPr>
-      </w:pPr>
-    </w:p>
-    <w:p>
-      <w:pPr>
-        <w:rPr>
-          <w:rFonts w:ascii="Noto Serif" w:eastAsia="Noto Serif SC" w:hAnsi="Noto Serif" w:cs="Noto Serif"/>
-          <w:sz w:val="18"/>
-        </w:rPr>
-      </w:pPr>
-    </w:p>
-    <w:p>
-      <w:pPr>
-        <w:rPr>
-          <w:rFonts w:ascii="Noto Serif" w:eastAsia="Noto Serif SC" w:hAnsi="Noto Serif" w:cs="Noto Serif"/>
-          <w:sz w:val="18"/>
-        </w:rPr>
-      </w:pPr>
-    </w:p>
-    <w:p>
-      <w:pPr>
-        <w:rPr>
-          <w:rFonts w:ascii="Noto Serif" w:eastAsia="Noto Serif SC" w:hAnsi="Noto Serif" w:cs="Noto Serif"/>
-          <w:sz w:val="18"/>
-        </w:rPr>
-      </w:pPr>
-    </w:p>
-    <w:p>
-      <w:pPr>
-        <w:rPr>
-          <w:rFonts w:ascii="Noto Serif" w:eastAsia="Noto Serif SC" w:hAnsi="Noto Serif" w:cs="Noto Serif"/>
-          <w:sz w:val="18"/>
-        </w:rPr>
-      </w:pPr>
-    </w:p>
-    <w:p>
-      <w:pPr>
-        <w:rPr>
-          <w:rFonts w:ascii="Noto Serif" w:eastAsia="Noto Serif SC" w:hAnsi="Noto Serif" w:cs="Noto Serif"/>
-          <w:sz w:val="18"/>
-        </w:rPr>
-      </w:pPr>
-    </w:p>
-    <w:p>
-      <w:pPr>
-        <w:rPr>
-          <w:rFonts w:ascii="Noto Serif" w:eastAsia="Noto Serif SC" w:hAnsi="Noto Serif" w:cs="Noto Serif"/>
-          <w:sz w:val="18"/>
-        </w:rPr>
-      </w:pPr>
-    </w:p>
-    <w:p>
-      <w:pPr>
-        <w:rPr>
-          <w:rFonts w:ascii="Noto Serif" w:eastAsia="Noto Serif SC" w:hAnsi="Noto Serif" w:cs="Noto Serif"/>
-          <w:sz w:val="18"/>
-        </w:rPr>
-      </w:pPr>
-    </w:p>
-    <w:p>
-      <w:pPr>
-        <w:rPr>
-          <w:rFonts w:ascii="Noto Serif" w:eastAsia="Noto Serif SC" w:hAnsi="Noto Serif" w:cs="Noto Serif"/>
-          <w:sz w:val="18"/>
-        </w:rPr>
-      </w:pPr>
-    </w:p>
-    <w:p>
-      <w:pPr>
-        <w:rPr>
-          <w:rFonts w:ascii="Noto Serif" w:eastAsia="Noto Serif SC" w:hAnsi="Noto Serif" w:cs="Noto Serif"/>
-          <w:sz w:val="18"/>
-        </w:rPr>
-      </w:pPr>
-    </w:p>
-    <w:p>
-      <w:pPr>
-        <w:rPr>
-          <w:rFonts w:ascii="Noto Serif" w:eastAsia="Noto Serif SC" w:hAnsi="Noto Serif" w:cs="Noto Serif"/>
-          <w:sz w:val="18"/>
-        </w:rPr>
-      </w:pPr>
-    </w:p>
-    <w:p>
-      <w:pPr>
-        <w:rPr>
-          <w:rFonts w:ascii="Noto Serif" w:eastAsia="Noto Serif SC" w:hAnsi="Noto Serif" w:cs="Noto Serif"/>
-          <w:sz w:val="18"/>
-        </w:rPr>
-      </w:pPr>
-    </w:p>
-    <w:p>
-      <w:pPr>
-        <w:rPr>
-          <w:rFonts w:ascii="Noto Serif" w:eastAsia="Noto Serif SC" w:hAnsi="Noto Serif" w:cs="Noto Serif"/>
-          <w:sz w:val="18"/>
-        </w:rPr>
-      </w:pPr>
-    </w:p>
-    <w:p>
-      <w:pPr>
-        <w:rPr>
-          <w:rFonts w:ascii="Noto Serif" w:eastAsia="Noto Serif SC" w:hAnsi="Noto Serif" w:cs="Noto Serif"/>
-          <w:sz w:val="18"/>
-        </w:rPr>
-      </w:pPr>
-    </w:p>
-    <w:p>
-      <w:pPr>
-        <w:rPr>
-          <w:rFonts w:ascii="Noto Serif" w:eastAsia="Noto Serif SC" w:hAnsi="Noto Serif" w:cs="Noto Serif"/>
-          <w:sz w:val="18"/>
-        </w:rPr>
-      </w:pPr>
-    </w:p>
-    <w:p>
-      <w:pPr>
-        <w:rPr>
-          <w:rFonts w:ascii="Noto Serif" w:eastAsia="Noto Serif SC" w:hAnsi="Noto Serif" w:cs="Noto Serif"/>
-          <w:sz w:val="18"/>
-        </w:rPr>
-      </w:pPr>
-    </w:p>
-    <w:p>
-      <w:pPr>
-        <w:rPr>
-          <w:rFonts w:ascii="Noto Serif" w:eastAsia="Noto Serif SC" w:hAnsi="Noto Serif" w:cs="Noto Serif"/>
-          <w:sz w:val="18"/>
-        </w:rPr>
-      </w:pPr>
-    </w:p>
-    <w:p>
-      <w:pPr>
-        <w:rPr>
-          <w:rFonts w:ascii="Noto Serif" w:eastAsia="Noto Serif SC" w:hAnsi="Noto Serif" w:cs="Noto Serif"/>
-          <w:sz w:val="18"/>
-        </w:rPr>
-      </w:pPr>
-    </w:p>
-    <w:p>
-      <w:pPr>
-        <w:rPr>
-          <w:rFonts w:ascii="Noto Serif" w:eastAsia="Noto Serif SC" w:hAnsi="Noto Serif" w:cs="Noto Serif"/>
-          <w:sz w:val="18"/>
-        </w:rPr>
-      </w:pPr>
-    </w:p>
-    <w:p>
-      <w:pPr>
-        <w:rPr>
-          <w:rFonts w:ascii="Noto Serif" w:eastAsia="Noto Serif SC" w:hAnsi="Noto Serif" w:cs="Noto Serif"/>
-          <w:sz w:val="18"/>
-        </w:rPr>
-      </w:pPr>
-    </w:p>
-    <w:p>
-      <w:pPr>
-        <w:rPr>
-          <w:rFonts w:ascii="Noto Serif" w:eastAsia="Noto Serif SC" w:hAnsi="Noto Serif" w:cs="Noto Serif"/>
-          <w:sz w:val="18"/>
-        </w:rPr>
-      </w:pPr>
-    </w:p>
-    <w:p>
-      <w:pPr>
-        <w:rPr>
-          <w:rFonts w:ascii="Noto Serif" w:eastAsia="Noto Serif SC" w:hAnsi="Noto Serif" w:cs="Noto Serif"/>
-          <w:sz w:val="18"/>
-        </w:rPr>
-      </w:pPr>
-    </w:p>
-    <w:p>
-      <w:pPr>
-        <w:rPr>
-          <w:rFonts w:ascii="Noto Serif" w:eastAsia="Noto Serif SC" w:hAnsi="Noto Serif" w:cs="Noto Serif"/>
-          <w:sz w:val="18"/>
-        </w:rPr>
-      </w:pPr>
-    </w:p>
-    <w:p>
-      <w:pPr>
-        <w:rPr>
-          <w:rFonts w:ascii="Noto Serif" w:eastAsia="Noto Serif SC" w:hAnsi="Noto Serif" w:cs="Noto Serif"/>
-          <w:sz w:val="18"/>
-        </w:rPr>
-      </w:pPr>
-    </w:p>
-    <w:p>
-      <w:pPr>
-        <w:rPr>
-          <w:rFonts w:ascii="Noto Serif" w:eastAsia="Noto Serif SC" w:hAnsi="Noto Serif" w:cs="Noto Serif"/>
-          <w:sz w:val="18"/>
-        </w:rPr>
-      </w:pPr>
-    </w:p>
-    <w:p>
-      <w:pPr>
-        <w:rPr>
-          <w:rFonts w:ascii="Noto Serif" w:eastAsia="Noto Serif SC" w:hAnsi="Noto Serif" w:cs="Noto Serif"/>
-          <w:sz w:val="18"/>
-        </w:rPr>
-      </w:pPr>
-    </w:p>
-    <w:p>
-      <w:pPr>
-        <w:rPr>
-          <w:rFonts w:ascii="Noto Serif" w:eastAsia="Noto Serif SC" w:hAnsi="Noto Serif" w:cs="Noto Serif"/>
-          <w:sz w:val="18"/>
-        </w:rPr>
-      </w:pPr>
-    </w:p>
-    <w:p>
-      <w:pPr>
-        <w:rPr>
-          <w:rFonts w:ascii="Noto Serif" w:eastAsia="Noto Serif SC" w:hAnsi="Noto Serif" w:cs="Noto Serif"/>
-          <w:sz w:val="18"/>
-        </w:rPr>
         <w:sectPr>
           <w:pgSz w:w="16840" w:h="23820"/>
           <w:pgMar w:top="1440" w:right="1800" w:bottom="1440" w:left="1800" w:header="708" w:footer="1417" w:gutter="0"/>
@@ -785,30 +365,7 @@
     </w:p>
     <w:p>
       <w:pPr>
-        <w:jc w:val="right"/>
-        <w:rPr>
-          <w:rFonts w:ascii="Noto Serif" w:eastAsia="Noto Serif SC" w:hAnsi="Noto Serif" w:cs="Noto Serif"/>
-          <w:b/>
-          <w:sz w:val="56"/>
-          <w:szCs w:val="96"/>
-          <w:lang w:val="en-US"/>
-        </w:rPr>
-      </w:pPr>
-    </w:p>
-    <w:p>
-      <w:pPr>
-        <w:jc w:val="right"/>
-        <w:rPr>
-          <w:rFonts w:ascii="Noto Serif" w:eastAsia="Noto Serif SC" w:hAnsi="Noto Serif" w:cs="Noto Serif"/>
-          <w:b/>
-          <w:sz w:val="56"/>
-          <w:szCs w:val="96"/>
-          <w:lang w:val="en-US"/>
-        </w:rPr>
-      </w:pPr>
-    </w:p>
-    <w:p>
-      <w:pPr>
+        <w:spacing w:before="2000"/>
         <w:jc w:val="right"/>
         <w:rPr>
           <w:rFonts w:ascii="Noto Serif" w:eastAsia="Noto Serif SC" w:hAnsi="Noto Serif" w:cs="Noto Serif"/>
@@ -912,17 +469,7 @@
     </w:p>
     <w:p>
       <w:pPr>
-        <w:jc w:val="right"/>
-        <w:rPr>
-          <w:rFonts w:ascii="Noto Serif" w:eastAsia="Noto Serif SC" w:hAnsi="Noto Serif" w:cs="Noto Serif"/>
-          <w:sz w:val="28"/>
-          <w:szCs w:val="28"/>
-          <w:lang w:val="en-US"/>
-        </w:rPr>
-      </w:pPr>
-    </w:p>
-    <w:p>
-      <w:pPr>
+        <w:spacing w:before="400"/>
         <w:jc w:val="right"/>
         <w:rPr>
           <w:rFonts w:ascii="Noto Serif" w:eastAsia="Noto Serif SC" w:hAnsi="Noto Serif" w:cs="Noto Serif"/>
@@ -942,6 +489,7 @@
     </w:p>
     <w:p>
       <w:pPr>
+        <w:spacing w:after="240"/>
         <w:jc w:val="right"/>
         <w:rPr>
           <w:rFonts w:ascii="Noto Serif" w:eastAsia="Noto Serif SC" w:hAnsi="Noto Serif" w:cs="Noto Serif"/>
@@ -957,23 +505,12 @@
         </w:rPr>
         <w:t>For Chinese Orchestra</w:t>
       </w:r>
-    </w:p>
-    <w:p>
-      <w:pPr>
-        <w:jc w:val="right"/>
-        <w:rPr>
-          <w:rFonts w:ascii="Noto Serif" w:eastAsia="Noto Serif SC" w:hAnsi="Noto Serif" w:cs="Noto Serif"/>
-          <w:sz w:val="32"/>
-          <w:szCs w:val="56"/>
-        </w:rPr>
-      </w:pPr>
     </w:p>
     <w:p>
       <w:pPr>
         <w:pBdr>
           <w:bottom w:val="single" w:sz="6" w:space="1" w:color="auto"/>
         </w:pBdr>
-        <w:jc w:val="right"/>
         <w:rPr>
           <w:rFonts w:ascii="Noto Serif" w:eastAsia="Noto Serif SC" w:hAnsi="Noto Serif" w:cs="Noto Serif"/>
           <w:sz w:val="32"/>
@@ -983,17 +520,7 @@
     </w:p>
     <w:p>
       <w:pPr>
-        <w:jc w:val="right"/>
-        <w:rPr>
-          <w:rFonts w:ascii="Noto Serif" w:eastAsia="Noto Serif SC" w:hAnsi="Noto Serif" w:cs="Noto Serif"/>
-          <w:sz w:val="40"/>
-          <w:szCs w:val="96"/>
-          <w:lang w:val="en-US"/>
-        </w:rPr>
-      </w:pPr>
-    </w:p>
-    <w:p>
-      <w:pPr>
+        <w:spacing w:before="400"/>
         <w:jc w:val="right"/>
         <w:rPr>
           <w:rFonts w:ascii="Noto Serif" w:eastAsia="Noto Serif SC" w:hAnsi="Noto Serif" w:cs="Noto Serif"/>
@@ -1013,6 +540,7 @@
     </w:p>
     <w:p>
       <w:pPr>
+        <w:spacing w:after="400"/>
         <w:jc w:val="right"/>
         <w:rPr>
           <w:rFonts w:ascii="Noto Serif" w:eastAsia="Noto Serif SC" w:hAnsi="Noto Serif" w:cs="Noto Serif"/>
@@ -1041,15 +569,7 @@
     </w:p>
     <w:p>
       <w:pPr>
-        <w:rPr>
-          <w:rFonts w:ascii="Noto Serif" w:eastAsia="Noto Serif SC" w:hAnsi="Noto Serif" w:cs="Noto Serif"/>
-          <w:sz w:val="40"/>
-          <w:szCs w:val="40"/>
-        </w:rPr>
-      </w:pPr>
-    </w:p>
-    <w:p>
-      <w:pPr>
+        <w:spacing w:after="400"/>
         <w:jc w:val="right"/>
         <w:rPr>
           <w:rFonts w:ascii="Noto Serif" w:eastAsia="Noto Serif SC" w:hAnsi="Noto Serif" w:cs="Noto Serif"/>
@@ -1076,110 +596,6 @@
           <w:sz w:val="32"/>
           <w:szCs w:val="32"/>
           <w:lang w:val="en-US"/>
-        </w:rPr>
-      </w:pPr>
-    </w:p>
-    <w:p>
-      <w:pPr>
-        <w:jc w:val="right"/>
-        <w:rPr>
-          <w:rFonts w:ascii="Noto Serif" w:eastAsia="Noto Serif SC" w:hAnsi="Noto Serif" w:cs="Noto Serif"/>
-          <w:sz w:val="32"/>
-          <w:szCs w:val="32"/>
-          <w:lang w:val="en-US"/>
-        </w:rPr>
-      </w:pPr>
-      <w:r>
-        <w:rPr>
-          <w:rFonts w:ascii="Noto Serif" w:eastAsia="Noto Serif SC" w:hAnsi="Noto Serif" w:cs="Noto Serif"/>
-          <w:sz w:val="32"/>
-          <w:szCs w:val="32"/>
-          <w:lang w:val="en-US"/>
-        </w:rPr>
-        <w:t>1</w:t>
-      </w:r>
-      <w:r>
-        <w:rPr>
-          <w:rFonts w:ascii="Noto Serif" w:eastAsia="Noto Serif SC" w:hAnsi="Noto Serif" w:cs="Noto Serif"/>
-          <w:sz w:val="32"/>
-          <w:szCs w:val="32"/>
-          <w:lang w:val="en-US"/>
-        </w:rPr>
-        <w:t>1</w:t>
-      </w:r>
-      <w:r>
-        <w:rPr>
-          <w:rFonts w:ascii="Noto Serif" w:eastAsia="Noto Serif SC" w:hAnsi="Noto Serif" w:cs="Noto Serif"/>
-          <w:sz w:val="32"/>
-          <w:szCs w:val="32"/>
-          <w:lang w:val="en-US"/>
-        </w:rPr>
-        <w:t>’</w:t>
-      </w:r>
-    </w:p>
-    <w:p>
-      <w:pPr>
-        <w:jc w:val="right"/>
-        <w:rPr>
-          <w:rFonts w:ascii="Noto Serif" w:eastAsia="Noto Serif SC" w:hAnsi="Noto Serif" w:cs="Noto Serif"/>
-          <w:sz w:val="40"/>
-          <w:szCs w:val="40"/>
-        </w:rPr>
-      </w:pPr>
-    </w:p>
-    <w:p>
-      <w:pPr>
-        <w:rPr>
-          <w:rFonts w:ascii="Noto Serif" w:eastAsia="Noto Serif SC" w:hAnsi="Noto Serif" w:cs="Noto Serif"/>
-          <w:sz w:val="18"/>
-        </w:rPr>
-      </w:pPr>
-    </w:p>
-    <w:p>
-      <w:pPr>
-        <w:rPr>
-          <w:rFonts w:ascii="Noto Serif" w:eastAsia="Noto Serif SC" w:hAnsi="Noto Serif" w:cs="Noto Serif"/>
-          <w:sz w:val="18"/>
-        </w:rPr>
-      </w:pPr>
-    </w:p>
-    <w:p>
-      <w:pPr>
-        <w:rPr>
-          <w:rFonts w:ascii="Noto Serif" w:eastAsia="Noto Serif SC" w:hAnsi="Noto Serif" w:cs="Noto Serif"/>
-          <w:sz w:val="18"/>
-        </w:rPr>
-      </w:pPr>
-    </w:p>
-    <w:p>
-      <w:pPr>
-        <w:rPr>
-          <w:rFonts w:ascii="Noto Serif" w:eastAsia="Noto Serif SC" w:hAnsi="Noto Serif" w:cs="Noto Serif"/>
-          <w:sz w:val="18"/>
-        </w:rPr>
-      </w:pPr>
-    </w:p>
-    <w:p>
-      <w:pPr>
-        <w:rPr>
-          <w:rFonts w:ascii="Noto Serif" w:eastAsia="Noto Serif SC" w:hAnsi="Noto Serif" w:cs="Noto Serif"/>
-          <w:sz w:val="18"/>
-        </w:rPr>
-      </w:pPr>
-    </w:p>
-    <w:p>
-      <w:pPr>
-        <w:rPr>
-          <w:rFonts w:ascii="Noto Serif" w:eastAsia="Noto Serif SC" w:hAnsi="Noto Serif" w:cs="Noto Serif"/>
-          <w:sz w:val="18"/>
-        </w:rPr>
-      </w:pPr>
-    </w:p>
-    <w:p>
-      <w:pPr>
-        <w:rPr>
-          <w:rFonts w:ascii="Noto Serif" w:eastAsia="Noto Serif SC" w:hAnsi="Noto Serif" w:cs="Noto Serif"/>
-          <w:sz w:val="18"/>
         </w:rPr>
         <w:sectPr>
           <w:pgSz w:w="16840" w:h="23820"/>
@@ -1189,6 +605,33 @@
           <w:docGrid w:linePitch="360"/>
         </w:sectPr>
       </w:pPr>
+      <w:r>
+        <w:rPr>
+          <w:rFonts w:ascii="Noto Serif" w:eastAsia="Noto Serif SC" w:hAnsi="Noto Serif" w:cs="Noto Serif"/>
+          <w:sz w:val="32"/>
+          <w:szCs w:val="32"/>
+          <w:lang w:val="en-US"/>
+        </w:rPr>
+        <w:t>1</w:t>
+      </w:r>
+      <w:r>
+        <w:rPr>
+          <w:rFonts w:ascii="Noto Serif" w:eastAsia="Noto Serif SC" w:hAnsi="Noto Serif" w:cs="Noto Serif"/>
+          <w:sz w:val="32"/>
+          <w:szCs w:val="32"/>
+          <w:lang w:val="en-US"/>
+        </w:rPr>
+        <w:t>1</w:t>
+      </w:r>
+      <w:r>
+        <w:rPr>
+          <w:rFonts w:ascii="Noto Serif" w:eastAsia="Noto Serif SC" w:hAnsi="Noto Serif" w:cs="Noto Serif"/>
+          <w:sz w:val="32"/>
+          <w:szCs w:val="32"/>
+          <w:lang w:val="en-US"/>
+        </w:rPr>
+        <w:t>’</w:t>
+      </w:r>
     </w:p>
     <w:p>
       <w:pPr>
@@ -1728,6 +1171,15 @@
           <w:lang w:val="en-US"/>
         </w:rPr>
         <w:t>网站</w:t>
+      </w:r>
+      <w:r>
+        <w:rPr>
+          <w:rFonts w:ascii="Noto Serif" w:eastAsia="Noto Serif SC" w:hAnsi="Noto Serif" w:cs="Noto Serif"/>
+          <w:sz w:val="20"/>
+          <w:szCs w:val="20"/>
+          <w:lang w:val="en-US"/>
+        </w:rPr>
+        <w:t xml:space="preserve"> </w:t>
       </w:r>
       <w:r>
         <w:rPr>
@@ -1776,6 +1228,15 @@
           <w:szCs w:val="20"/>
           <w:lang w:val="en-US"/>
         </w:rPr>
+        <w:t xml:space="preserve"> </w:t>
+      </w:r>
+      <w:r>
+        <w:rPr>
+          <w:rFonts w:ascii="Noto Serif" w:eastAsia="Noto Serif SC" w:hAnsi="Noto Serif" w:cs="Noto Serif"/>
+          <w:sz w:val="20"/>
+          <w:szCs w:val="20"/>
+          <w:lang w:val="en-US"/>
+        </w:rPr>
         <w:t>Email: </w:t>
       </w:r>
       <w:hyperlink r:id="rId12" w:tgtFrame="_blank" w:history="1">
@@ -1816,6 +1277,15 @@
           <w:szCs w:val="20"/>
           <w:lang w:val="en-US"/>
         </w:rPr>
+        <w:t xml:space="preserve"> </w:t>
+      </w:r>
+      <w:r>
+        <w:rPr>
+          <w:rFonts w:ascii="Noto Serif" w:eastAsia="Noto Serif SC" w:hAnsi="Noto Serif" w:cs="Noto Serif"/>
+          <w:sz w:val="20"/>
+          <w:szCs w:val="20"/>
+          <w:lang w:val="en-US"/>
+        </w:rPr>
         <w:t>Telephone: (65) 6557 402</w:t>
       </w:r>
       <w:r>
@@ -1852,6 +1322,15 @@
           <w:lang w:val="en-US"/>
         </w:rPr>
         <w:t>传真</w:t>
+      </w:r>
+      <w:r>
+        <w:rPr>
+          <w:rFonts w:ascii="Noto Serif" w:eastAsia="Noto Serif SC" w:hAnsi="Noto Serif" w:cs="Noto Serif"/>
+          <w:sz w:val="20"/>
+          <w:szCs w:val="20"/>
+          <w:lang w:val="en-US"/>
+        </w:rPr>
+        <w:t xml:space="preserve"> </w:t>
       </w:r>
       <w:r>
         <w:rPr>

</xml_diff>